<commit_message>
Rewrite results writeup and Word doc in plain language
</commit_message>
<xml_diff>
--- a/analysis/Section2_nontidal_predictive_value.docx
+++ b/analysis/Section2_nontidal_predictive_value.docx
@@ -12,10 +12,10 @@
           <w:b/>
           <w:bCs/>
           <w:color w:val="1F3B63"/>
-          <w:sz w:val="30"/>
-          <w:szCs w:val="30"/>
-        </w:rPr>
-        <w:t xml:space="preserve">Predictive Value of Nontidal Data for Tidal </w:t>
+          <w:sz w:val="28"/>
+          <w:szCs w:val="28"/>
+        </w:rPr>
+        <w:t xml:space="preserve">Does incorporating nontidal data improve prediction of tidal </w:t>
       </w:r>
       <w:r>
         <w:rPr>
@@ -25,10 +25,21 @@
           <w:i/>
           <w:iCs/>
           <w:color w:val="1F3B63"/>
-          <w:sz w:val="30"/>
-          <w:szCs w:val="30"/>
+          <w:sz w:val="28"/>
+          <w:szCs w:val="28"/>
         </w:rPr>
         <w:t xml:space="preserve">Enterococcus</w:t>
+      </w:r>
+      <w:r>
+        <w:rPr>
+          <w:rFonts w:ascii="Calibri" w:cs="Calibri" w:eastAsia="Calibri" w:hAnsi="Calibri"/>
+          <w:b/>
+          <w:bCs/>
+          <w:color w:val="1F3B63"/>
+          <w:sz w:val="28"/>
+          <w:szCs w:val="28"/>
+        </w:rPr>
+        <w:t xml:space="preserve">?</w:t>
       </w:r>
     </w:p>
     <w:p>
@@ -44,7 +55,7 @@
           <w:sz w:val="20"/>
           <w:szCs w:val="20"/>
         </w:rPr>
-        <w:t xml:space="preserve">Blue Water Baltimore — Ambient Water-Quality Monitoring Program, 2013–2024</w:t>
+        <w:t xml:space="preserve">Blue Water Baltimore Ambient Water Quality Monitoring Program, 2013-2024. Draft results section.</w:t>
       </w:r>
     </w:p>
     <w:p>
@@ -80,7 +91,7 @@
           <w:sz w:val="22"/>
           <w:szCs w:val="22"/>
         </w:rPr>
-        <w:t xml:space="preserve">We tested whether nontidal (upstream stream) monitoring data adds predictive value for </w:t>
+        <w:t xml:space="preserve">I tested whether nontidal (upstream stream) monitoring data helps predict </w:t>
       </w:r>
       <w:r>
         <w:rPr>
@@ -98,7 +109,7 @@
           <w:sz w:val="22"/>
           <w:szCs w:val="22"/>
         </w:rPr>
-        <w:t xml:space="preserve"> at the tidal harbor stations (Patapsco / Baltimore Harbor). Gwynns Falls and Jones Falls drain into the harbor, so their water quality is a plausible leading indicator of harbor bacteria.</w:t>
+        <w:t xml:space="preserve"> at the tidal harbor stations (Patapsco / Baltimore Harbor). Gwynns Falls and Jones Falls drain into the harbor, so their water quality could be an early indicator of harbor bacteria.</w:t>
       </w:r>
     </w:p>
     <w:p>
@@ -126,7 +137,7 @@
           <w:sz w:val="22"/>
           <w:szCs w:val="22"/>
         </w:rPr>
-        <w:t xml:space="preserve">A nested-model comparison holding the samples, cross-validation folds, and estimator fixed:</w:t>
+        <w:t xml:space="preserve">A nested-model comparison, holding the samples, cross-validation folds, and model fixed:</w:t>
       </w:r>
     </w:p>
     <w:tbl>
@@ -291,7 +302,7 @@
                 <w:sz w:val="20"/>
                 <w:szCs w:val="20"/>
               </w:rPr>
-              <w:t xml:space="preserve">Season + station location/site + the harbor’s own in-situ panel (nutrient chemistry and surface sonde: temperature, pH, conductance, salinity, DO)</w:t>
+              <w:t xml:space="preserve">Season, station location and site, and the harbor’s own in-situ panel (nutrient chemistry plus surface sonde: temperature, pH, conductance, salinity, DO)</w:t>
             </w:r>
           </w:p>
         </w:tc>
@@ -319,7 +330,7 @@
                 <w:sz w:val="20"/>
                 <w:szCs w:val="20"/>
               </w:rPr>
-              <w:t xml:space="preserve">Best harbor-only baseline</w:t>
+              <w:t xml:space="preserve">Harbor-only baseline</w:t>
             </w:r>
           </w:p>
         </w:tc>
@@ -377,7 +388,7 @@
                 <w:sz w:val="20"/>
                 <w:szCs w:val="20"/>
               </w:rPr>
-              <w:t xml:space="preserve">T1 + upstream stream-network state: stream Enterococcus (network mean/max and per-watershed), plus stream turbidity, total phosphorus, DO, nitrate, conductance, temperature</w:t>
+              <w:t xml:space="preserve">T1 plus the upstream stream network: stream Enterococcus (network mean and max, and per-watershed), plus stream turbidity, total phosphorus, DO, nitrate, conductance, temperature</w:t>
             </w:r>
           </w:p>
         </w:tc>
@@ -463,7 +474,7 @@
                 <w:sz w:val="20"/>
                 <w:szCs w:val="20"/>
               </w:rPr>
-              <w:t xml:space="preserve">Season + location + upstream stream data (no harbor chemistry)</w:t>
+              <w:t xml:space="preserve">Season, location, and upstream stream data (no harbor chemistry)</w:t>
             </w:r>
           </w:p>
         </w:tc>
@@ -491,7 +502,7 @@
                 <w:sz w:val="20"/>
                 <w:szCs w:val="20"/>
               </w:rPr>
-              <w:t xml:space="preserve">Can upstream data alone nowcast the harbor?</w:t>
+              <w:t xml:space="preserve">Can upstream data alone predict the harbor?</w:t>
             </w:r>
           </w:p>
         </w:tc>
@@ -543,7 +554,7 @@
           <w:sz w:val="22"/>
           <w:szCs w:val="22"/>
         </w:rPr>
-        <w:t xml:space="preserve">Temporal join: </w:t>
+        <w:t xml:space="preserve">Matching: </w:t>
       </w:r>
       <w:r>
         <w:rPr>
@@ -551,7 +562,7 @@
           <w:sz w:val="22"/>
           <w:szCs w:val="22"/>
         </w:rPr>
-        <w:t xml:space="preserve">each harbor sample matched to the nearest stream-network state within ±7 days (the nearest survey is within one day for the median sample; within seven days for 87%). </w:t>
+        <w:t xml:space="preserve">harbor and stream samples rarely fall on the same day, but the nearest stream survey is within 1 day for the median harbor sample and within 7 days for about 87% of them. Each harbor sample is matched to the nearest stream reading within 7 days; a backward-only match gives the same result. </w:t>
       </w:r>
       <w:r>
         <w:rPr>
@@ -569,7 +580,7 @@
           <w:sz w:val="22"/>
           <w:szCs w:val="22"/>
         </w:rPr>
-        <w:t xml:space="preserve">year-blocked cross-validation (whole calendar years held out) so no survey week is split across train and test; all metrics are out-of-fold.</w:t>
+        <w:t xml:space="preserve">year-blocked cross-validation, holding out whole calendar years so no sampling week is split across train and test. All metrics are out-of-fold.</w:t>
       </w:r>
     </w:p>
     <w:p>
@@ -597,7 +608,7 @@
           <w:sz w:val="22"/>
           <w:szCs w:val="22"/>
         </w:rPr>
-        <w:t xml:space="preserve">Adding upstream data improves the harbor model on every metric. On the matched subset (harbor samples with an upstream survey within seven days; n = 3,121, exceedance base rate 16.6%):</w:t>
+        <w:t xml:space="preserve">Adding upstream data improves the harbor model on every metric. On the matched subset (harbor samples with an upstream survey within 7 days; n = 3,121, exceedance rate 16.6%):</w:t>
       </w:r>
     </w:p>
     <w:tbl>
@@ -794,7 +805,7 @@
                 <w:sz w:val="20"/>
                 <w:szCs w:val="20"/>
               </w:rPr>
-              <w:t xml:space="preserve">T1 — harbor in-situ WQ (base)</w:t>
+              <w:t xml:space="preserve">T1, harbor in-situ WQ (base)</w:t>
             </w:r>
           </w:p>
         </w:tc>
@@ -936,7 +947,7 @@
                 <w:sz w:val="20"/>
                 <w:szCs w:val="20"/>
               </w:rPr>
-              <w:t xml:space="preserve">T2 — + nontidal data</w:t>
+              <w:t xml:space="preserve">T2, plus nontidal data</w:t>
             </w:r>
           </w:p>
         </w:tc>
@@ -1078,7 +1089,7 @@
                 <w:sz w:val="20"/>
                 <w:szCs w:val="20"/>
               </w:rPr>
-              <w:t xml:space="preserve">T3 — nontidal only</w:t>
+              <w:t xml:space="preserve">T3, nontidal only</w:t>
             </w:r>
           </w:p>
         </w:tc>
@@ -1220,7 +1231,7 @@
                 <w:sz w:val="20"/>
                 <w:szCs w:val="20"/>
               </w:rPr>
-              <w:t xml:space="preserve">Lift (T2 − T1)</w:t>
+              <w:t xml:space="preserve">Change (T2 minus T1)</w:t>
             </w:r>
           </w:p>
         </w:tc>
@@ -1348,7 +1359,7 @@
           <w:sz w:val="22"/>
           <w:szCs w:val="22"/>
         </w:rPr>
-        <w:t xml:space="preserve">On the full harbor sample (n = 3,581) the lift is smaller but in the same direction (R² +0.024, AUC +0.053, PR-AUC +0.121). The added block is highly significant: in models with year fixed effects, regression of log</w:t>
+        <w:t xml:space="preserve">On the full harbor sample (n = 3,581) the improvement is smaller but in the same direction (R² +0.024, AUC +0.053, PR-AUC +0.121). The added block is significant: with year fixed effects, regression of log</w:t>
       </w:r>
       <w:r>
         <w:rPr>
@@ -1364,15 +1375,7 @@
           <w:sz w:val="22"/>
           <w:szCs w:val="22"/>
         </w:rPr>
-        <w:t xml:space="preserve">(Enterococcus) rises from adjusted R² 0.335 to 0.386 (partial-F</w:t>
-      </w:r>
-      <w:r>
-        <w:rPr>
-          <w:rFonts w:ascii="Calibri" w:cs="Calibri" w:eastAsia="Calibri" w:hAnsi="Calibri"/>
-          <w:sz w:val="22"/>
-          <w:szCs w:val="22"/>
-        </w:rPr>
-        <w:t xml:space="preserve"> = 22.4, p &lt; 0.001), and exceedance pseudo-R² rises 0.273 to 0.344 (likelihood-ratio χ² = 200, p &lt; 0.001). The lift is stable across random seeds and estimators (Random Forest ΔR² = +0.116; Gradient Boosting +0.072).</w:t>
+        <w:t xml:space="preserve">(Enterococcus) rises from adjusted R² 0.335 to 0.386 (partial-F = 22.4, p &lt; 0.001), and exceedance pseudo-R² rises from 0.273 to 0.344 (likelihood-ratio chi² = 200, p &lt; 0.001). The improvement is stable across random seeds and models (Random Forest change in R² = +0.116, Gradient Boosting +0.072).</w:t>
       </w:r>
     </w:p>
     <w:p>
@@ -1431,8 +1434,6 @@
           <w:rFonts w:ascii="Calibri" w:cs="Calibri" w:eastAsia="Calibri" w:hAnsi="Calibri"/>
           <w:b/>
           <w:bCs/>
-          <w:i/>
-          <w:iCs/>
           <w:color w:val="595959"/>
           <w:sz w:val="18"/>
           <w:szCs w:val="18"/>
@@ -1442,13 +1443,11 @@
       <w:r>
         <w:rPr>
           <w:rFonts w:ascii="Calibri" w:cs="Calibri" w:eastAsia="Calibri" w:hAnsi="Calibri"/>
-          <w:i/>
-          <w:iCs/>
           <w:color w:val="595959"/>
           <w:sz w:val="18"/>
           <w:szCs w:val="18"/>
         </w:rPr>
-        <w:t xml:space="preserve">Nested-model comparison (matched subset, year-blocked cross-validation). Adding upstream nontidal data raises both regression skill and exceedance-classification AUC over the harbor-only baseline.</w:t>
+        <w:t xml:space="preserve">Nested-model comparison on the matched subset, year-blocked cross-validation. Adding upstream nontidal data raises both regression skill and exceedance AUC over the harbor-only baseline.</w:t>
       </w:r>
     </w:p>
     <w:p>
@@ -1507,8 +1506,6 @@
           <w:rFonts w:ascii="Calibri" w:cs="Calibri" w:eastAsia="Calibri" w:hAnsi="Calibri"/>
           <w:b/>
           <w:bCs/>
-          <w:i/>
-          <w:iCs/>
           <w:color w:val="595959"/>
           <w:sz w:val="18"/>
           <w:szCs w:val="18"/>
@@ -1518,13 +1515,11 @@
       <w:r>
         <w:rPr>
           <w:rFonts w:ascii="Calibri" w:cs="Calibri" w:eastAsia="Calibri" w:hAnsi="Calibri"/>
-          <w:i/>
-          <w:iCs/>
           <w:color w:val="595959"/>
           <w:sz w:val="18"/>
           <w:szCs w:val="18"/>
         </w:rPr>
-        <w:t xml:space="preserve">Dose–response. The share of harbor samples exceeding 104 MPN/100 mL rises monotonically with same-week upstream stream Enterococcus, from ~1% to ~38%.</w:t>
+        <w:t xml:space="preserve">The share of harbor samples exceeding 104 MPN/100 mL rises steadily with same-week upstream stream Enterococcus, from about 1% to about 38%.</w:t>
       </w:r>
     </w:p>
     <w:p>
@@ -1583,8 +1578,6 @@
           <w:rFonts w:ascii="Calibri" w:cs="Calibri" w:eastAsia="Calibri" w:hAnsi="Calibri"/>
           <w:b/>
           <w:bCs/>
-          <w:i/>
-          <w:iCs/>
           <w:color w:val="595959"/>
           <w:sz w:val="18"/>
           <w:szCs w:val="18"/>
@@ -1594,8 +1587,6 @@
       <w:r>
         <w:rPr>
           <w:rFonts w:ascii="Calibri" w:cs="Calibri" w:eastAsia="Calibri" w:hAnsi="Calibri"/>
-          <w:i/>
-          <w:iCs/>
           <w:color w:val="595959"/>
           <w:sz w:val="18"/>
           <w:szCs w:val="18"/>
@@ -1628,7 +1619,7 @@
           <w:sz w:val="22"/>
           <w:szCs w:val="22"/>
         </w:rPr>
-        <w:t xml:space="preserve">Incorporating nontidal stream data materially improves nowcasting of harbor </w:t>
+        <w:t xml:space="preserve">Adding nontidal stream data clearly improves prediction of harbor </w:t>
       </w:r>
       <w:r>
         <w:rPr>
@@ -1646,7 +1637,7 @@
           <w:sz w:val="22"/>
           <w:szCs w:val="22"/>
         </w:rPr>
-        <w:t xml:space="preserve">, and upstream data alone (T3) nearly matches the harbor-only baseline — useful where harbor chemistry is unavailable. The strongest signal is the streams’ own bacteria, consistent with the streams delivering a load the harbor then registers.</w:t>
+        <w:t xml:space="preserve">, and upstream data alone (T3) predicts almost as well as the harbor’s own chemistry, which is useful where harbor chemistry is limited. The strongest signal is the streams’ own bacteria, consistent with the streams carrying a load that the harbor then registers.</w:t>
       </w:r>
     </w:p>
     <w:p>
@@ -1656,20 +1647,10 @@
       <w:r>
         <w:rPr>
           <w:rFonts w:ascii="Calibri" w:cs="Calibri" w:eastAsia="Calibri" w:hAnsi="Calibri"/>
-          <w:b/>
-          <w:bCs/>
           <w:sz w:val="22"/>
           <w:szCs w:val="22"/>
         </w:rPr>
-        <w:t xml:space="preserve">Caveat. </w:t>
-      </w:r>
-      <w:r>
-        <w:rPr>
-          <w:rFonts w:ascii="Calibri" w:cs="Calibri" w:eastAsia="Calibri" w:hAnsi="Calibri"/>
-          <w:sz w:val="22"/>
-          <w:szCs w:val="22"/>
-        </w:rPr>
-        <w:t xml:space="preserve">Upstream bacteria are rain-driven, so part of this lift may overlap with the antecedent-rainfall signal found strong in the harbor. Re-running T1 versus T2 with the rainfall block already in the base isolates the purely hydrologic (stream-transport) contribution, and is the recommended next step. The daily USGS discharge series, once available, slots directly into the same upstream feature set to test whether streamflow adds value on top of stream chemistry.</w:t>
+        <w:t xml:space="preserve">One caveat: upstream bacteria are rain-driven, so some of this improvement may overlap with the antecedent-rainfall signal that was strong in the harbor in Section 1. Adding the rainfall term to the baseline before comparing T1 and T2 would separate the stream-transport effect from shared weather, and is the recommended next step. The daily USGS discharge series, once available, plugs into the same upstream feature set to test whether streamflow adds anything on top of stream chemistry.</w:t>
       </w:r>
     </w:p>
     <w:sectPr>

</xml_diff>